<commit_message>
Update anon72 engine, docs, test results, and add business plan generators
- anon72.py: improved overlap resolution for multi-word foreign names,
  orphan surname post-pass, international diacritics support, standalone
  first-name detection improvements
- Updated all technical documentation with accurate name library count
  (~7k unique names, not 224k) and latest feature descriptions
- Re-anonymized 200+ test contracts with updated engine
- Updated test results and validation reports
- Added generate_final_report.py and generate_business_plan.py for
  PDF report generation with updated pricing model (Solo/Office/Enterprise)
- Added new test contracts (smlouva_gdpr_test_51-150, smlouva_final_01-15)
  with anonymized outputs and maps

Made-with: Cursor
</commit_message>
<xml_diff>
--- a/test_data/smlouva 30_anon.docx
+++ b/test_data/smlouva 30_anon.docx
@@ -83,7 +83,7 @@
         <w:spacing w:before="100" w:after="50"/>
       </w:pPr>
       <w:r>
-        <w:t>Dlužník [[PERSON_7]] ([[BIRTH_ID_6]], bytem Lesní 67/3, Jihlava 586 01, [[PHONE_2]]) má evidováno 9 exekucí v celkové výši 1 456 800 Kč. Věřitelem je společnost CrediFin a.s., [[ICO_2]]. Dlužnice [[PERSON_7]] požádala o oddlužení. Ručitelem byl Bc. [[PERSON_6]] ([[BIRTH_ID_7]], [[BANK_2]]), který za ni zaplatil částku 240 000 Kč.</w:t>
+        <w:t>Dlužník [[PERSON_7]] ([[BIRTH_ID_6]], [[ADDRESS_3]], [[PHONE_2]]) má evidováno 9 exekucí v celkové výši 1 456 800 Kč. Věřitelem je společnost CrediFin a.s., [[ICO_2]]. Dlužnice [[PERSON_7]] požádala o oddlužení. Ručitelem byl Bc. [[PERSON_6]] ([[BIRTH_ID_7]], [[BANK_2]]), který za ni zaplatil částku 240 000 Kč.</w:t>
       </w:r>
     </w:p>
     <w:p>
@@ -91,7 +91,7 @@
         <w:spacing w:before="50" w:after="50"/>
       </w:pPr>
       <w:r>
-        <w:t>Žadatel [[PERSON_8]] ([[BIRTH_ID_8]], IČO podnikatele: [[ICO_3]], [[ADDRESS_3]], email: [[EMAIL_2]], [[PHONE_3]]) požádal o úvěr ve výši 3 500 000 Kč. Žadateli [[PERSON_8]] byl úvěr schválen s úrokovou sazbou 6,25 % p.a. Klientem banky je již od roku 2018. Pojištěnec [[PERSON_8]] má životní pojištění ve výši 5 000 000 Kč u Česká pojišťovna a.s.</w:t>
+        <w:t>Žadatel [[PERSON_8]] ([[BIRTH_ID_8]], IČO podnikatele: [[ICO_3]], [[ADDRESS_4]], email: [[EMAIL_2]], [[PHONE_3]]) požádal o úvěr ve výši 3 500 000 Kč. Žadateli [[PERSON_8]] byl úvěr schválen s úrokovou sazbou 6,25 % p.a. Klientem banky je již od roku 2018. Pojištěnec [[PERSON_8]] má životní pojištění ve výši 5 000 000 Kč u Česká pojišťovna a.s.</w:t>
       </w:r>
     </w:p>
     <w:p>
@@ -108,7 +108,7 @@
         <w:spacing w:before="100" w:after="50"/>
       </w:pPr>
       <w:r>
-        <w:t>Pacient prof. MUDr. [[PERSON_9]], CSc. ([[BIRTH_ID_9]], číslo pojištěnce VZP[[PHONE_4]], [[ADDRESS_4]]) byl hospitalizován pro infarkt myokardu I21.9. Nemocný [[PERSON_9]] podstoupil urgentní kardiochirurgický zákrok. Ošetřující lékař MUDr. [[PERSON_10]], Ph.D. (registrace ČLK: 89012) indikoval následnou rehabilitaci. Vyšetřený pacient [[PERSON_9]] byl po 14 dnech propuštěn do domácí péče.</w:t>
+        <w:t>Pacient prof. MUDr. [[PERSON_9]], CSc. ([[BIRTH_ID_9]], [[BIRTH_ID_10]], [[ADDRESS_5]]) byl hospitalizován pro infarkt myokardu I21.9. Nemocný [[PERSON_9]] podstoupil urgentní kardiochirurgický zákrok. Ošetřující lékař MUDr. [[PERSON_10]], Ph.D. (registrace ČLK: 89012) indikoval následnou rehabilitaci. Vyšetřený pacient [[PERSON_9]] byl po 14 dnech propuštěn do domácí péče.</w:t>
       </w:r>
     </w:p>
     <w:p>
@@ -116,7 +116,7 @@
         <w:spacing w:before="50" w:after="50"/>
       </w:pPr>
       <w:r>
-        <w:t>Pacientka Ing. [[PERSON_11]] ([[BIRTH_ID_10]], pojištěnka OZP[[PHONE_5]], [[ADDRESS_5]], [[PHONE_6]]) má diagnostikovanou roztroušenou sklerózu G35. Léčená [[PERSON_11]] dostává biologickou léčbu interferonem beta. Operovaná [[PERSON_11]] podstoupila v minulosti také operaci kardiostimulátoru. Invalidní důchod II. stupně činí 12 800 Kč měsíčně.</w:t>
+        <w:t>Pacientka Ing. [[PERSON_11]] ([[BIRTH_ID_11]], pojištěnka OZP[[PHONE_4]], [[ADDRESS_6]], [[PHONE_5]]) má diagnostikovanou roztroušenou sklerózu G35. Léčená [[PERSON_11]] dostává biologickou léčbu interferonem beta. Operovaná [[PERSON_11]] podstoupila v minulosti také operaci kardiostimulátoru. Invalidní důchod II. stupně činí 12 800 Kč měsíčně.</w:t>
       </w:r>
     </w:p>
     <w:p>
@@ -133,7 +133,7 @@
         <w:spacing w:before="100" w:after="50"/>
       </w:pPr>
       <w:r>
-        <w:t>Rozvedený [[PERSON_15]] ([[BIRTH_ID_11]], [[ADDRESS_6]], email: [[EMAIL_3]]) má povinnost platit výživné na nezletilé [[PERSON_14]] ([[BIRTH_ID_12]]) a [[PERSON_13]] ([[BIRTH_ID_13]]) ve výši 9 500 Kč měsíčně na každé dítě. Plátce [[PERSON_15]] je v prodlení s platbami celkem 57 000 Kč. Příjemkyní výživného je bývalá manželka PhDr. [[PERSON_12]] ([[BIRTH_ID_14]], [[BANK_3]]).</w:t>
+        <w:t>Rozvedený [[PERSON_15]] ([[BIRTH_ID_12]], [[ADDRESS_7]], email: [[EMAIL_3]]) má povinnost platit výživné na nezletilé [[PERSON_14]] ([[BIRTH_ID_13]]) a [[PERSON_13]] ([[BIRTH_ID_14]]) ve výši 9 500 Kč měsíčně na každé dítě. Plátce [[PERSON_15]] je v prodlení s platbami celkem 57 000 Kč. Příjemkyní výživného je bývalá manželka PhDr. [[PERSON_12]] ([[BIRTH_ID_15]], [[BANK_3]]).</w:t>
       </w:r>
     </w:p>
     <w:p>
@@ -141,7 +141,7 @@
         <w:spacing w:before="50" w:after="50"/>
       </w:pPr>
       <w:r>
-        <w:t>Opatrovník JUDr. [[PERSON_16]] ([[BIRTH_ID_15]], registrace ČAK: 67890, [[ADDRESS_7]]) byl ustanoven pro [[PERSON_17]] ([[BIRTH_ID_16]], [[ADDRESS_8]]), která byla zbavena způsobilosti k právním úkonům. Opatrovance [[PERSON_17]] náleží důchod 19 400 Kč měsíčně a nemovitost v hodnotě 6 200 000 Kč na LV č. 7823.</w:t>
+        <w:t>Opatrovník JUDr. [[PERSON_16]] ([[BIRTH_ID_16]], registrace ČAK: 67890, [[ADDRESS_8]]) byl ustanoven pro [[PERSON_17]] ([[BIRTH_ID_17]], [[ADDRESS_9]]), která byla zbavena způsobilosti k právním úkonům. Opatrovance [[PERSON_17]] náleží důchod 19 400 Kč měsíčně a nemovitost v hodnotě 6 200 000 Kč na LV č. 7823.</w:t>
       </w:r>
     </w:p>
     <w:p>
@@ -158,7 +158,7 @@
         <w:spacing w:before="100" w:after="50"/>
       </w:pPr>
       <w:r>
-        <w:t>Zaměstnanec Mgr. [[PERSON_18]] ([[BIRTH_ID_17]], osobní číslo: 2023-HR-0789, [[ADDRESS_9]], email: [[EMAIL_4]], [[PHONE_7]]) podal výpověď. Zaměstnanci [[PERSON_18]] bylo vyplaceno odstupné ve výši 186 400 Kč na [[BANK_4]]. Jeho nástupcem je uchazeč Bc. [[PERSON_19]] ([[BIRTH_ID_18]], [[ADDRESS_10]]).</w:t>
+        <w:t>Zaměstnanec Mgr. [[PERSON_18]] ([[BIRTH_ID_18]], osobní číslo: 2023-HR-0789, [[ADDRESS_10]], email: [[EMAIL_4]], [[PHONE_6]]) podal výpověď. Zaměstnanci [[PERSON_18]] bylo vyplaceno odstupné ve výši 186 400 Kč na [[BANK_4]]. Jeho nástupcem je uchazeč Bc. [[PERSON_19]] ([[BIRTH_ID_19]], [[ADDRESS_11]]).</w:t>
       </w:r>
     </w:p>
     <w:p>
@@ -166,7 +166,7 @@
         <w:spacing w:before="50" w:after="50"/>
       </w:pPr>
       <w:r>
-        <w:t>Důchodkyně [[PERSON_21]] ([[BIRTH_ID_19]], [[ADDRESS_11]], Frýdek-Místek 738 01, [[PHONE_8]]) pobírá starobní důchod ve výši 17 800 Kč měsíčně. Oprávněná [[PERSON_20]] má nárok také na příspěvek na bydlení 4 500 Kč. Držitelka průkazu ZTP má nárok na slevy v MHD. Beneficientkou jejího životního pojištění je dcera Ing. [[PERSON_20]] ([[BIRTH_ID_20]]).</w:t>
+        <w:t>Důchodkyně [[PERSON_21]] ([[BIRTH_ID_20]], [[ADDRESS_12]], [[PHONE_7]]) pobírá starobní důchod ve výši 17 800 Kč měsíčně. Oprávněná [[PERSON_20]] má nárok také na příspěvek na bydlení 4 500 Kč. Držitelka průkazu ZTP má nárok na slevy v MHD. Beneficientkou jejího životního pojištění je dcera Ing. [[PERSON_20]] ([[BIRTH_ID_21]]).</w:t>
       </w:r>
     </w:p>
     <w:p>
@@ -183,7 +183,7 @@
         <w:spacing w:before="100" w:after="50"/>
       </w:pPr>
       <w:r>
-        <w:t>Žákyně [[PERSON_23]] ([[BIRTH_ID_21]], [[ADDRESS_12]]) byla přijata na Gymnázium Karlovy Vary. Studentka [[PERSON_22]] získala sociální stipendium 3 500 Kč měsíčně. Zákonnou zástupkyní je Mgr. [[PERSON_22]] ([[BIRTH_ID_14]], email: [[EMAIL_5]], [[PHONE_9]]). Přijatá žákyně [[PERSON_23]] začíná docházku od [[DATE_2]].</w:t>
+        <w:t>Žákyně [[PERSON_23]] ([[BIRTH_ID_22]], [[ADDRESS_13]]) byla přijata na Gymnázium Karlovy Vary. Studentka [[PERSON_22]] získala sociální stipendium 3 500 Kč měsíčně. Zákonnou zástupkyní je Mgr. [[PERSON_22]] ([[BIRTH_ID_15]], email: [[EMAIL_5]], [[PHONE_8]]). Přijatá žákyně [[PERSON_23]] začíná docházku od [[DATE_2]].</w:t>
       </w:r>
     </w:p>
     <w:p>
@@ -330,7 +330,7 @@
           </w:tcPr>
           <w:p>
             <w:r>
-              <w:t>[[BIRTH_ID_40]]</w:t>
+              <w:t>[[BIRTH_ID_42]]</w:t>
             </w:r>
           </w:p>
         </w:tc>
@@ -364,23 +364,23 @@
           </w:tcPr>
           <w:p>
             <w:r>
-              <w:t>MUDr. [[PERSON_46]]</w:t>
-            </w:r>
-          </w:p>
-        </w:tc>
-        <w:tc>
-          <w:tcPr>
-            <w:tcW w:type="dxa" w:w="3000"/>
-            <w:tcBorders>
-              <w:top w:val="single" w:color="999999" w:sz="1"/>
-              <w:left w:val="single" w:color="999999" w:sz="1"/>
-              <w:bottom w:val="single" w:color="999999" w:sz="1"/>
-              <w:right w:val="single" w:color="999999" w:sz="1"/>
-            </w:tcBorders>
-          </w:tcPr>
-          <w:p>
-            <w:r>
-              <w:t>[[BIRTH_ID_24]]</w:t>
+              <w:t>MUDr.</w:t>
+            </w:r>
+          </w:p>
+        </w:tc>
+        <w:tc>
+          <w:tcPr>
+            <w:tcW w:type="dxa" w:w="3000"/>
+            <w:tcBorders>
+              <w:top w:val="single" w:color="999999" w:sz="1"/>
+              <w:left w:val="single" w:color="999999" w:sz="1"/>
+              <w:bottom w:val="single" w:color="999999" w:sz="1"/>
+              <w:right w:val="single" w:color="999999" w:sz="1"/>
+            </w:tcBorders>
+          </w:tcPr>
+          <w:p>
+            <w:r>
+              <w:t>[[BIRTH_ID_25]]</w:t>
             </w:r>
           </w:p>
         </w:tc>
@@ -414,23 +414,23 @@
           </w:tcPr>
           <w:p>
             <w:r>
-              <w:t>JUDr. [[PERSON_47]]</w:t>
-            </w:r>
-          </w:p>
-        </w:tc>
-        <w:tc>
-          <w:tcPr>
-            <w:tcW w:type="dxa" w:w="3000"/>
-            <w:tcBorders>
-              <w:top w:val="single" w:color="999999" w:sz="1"/>
-              <w:left w:val="single" w:color="999999" w:sz="1"/>
-              <w:bottom w:val="single" w:color="999999" w:sz="1"/>
-              <w:right w:val="single" w:color="999999" w:sz="1"/>
-            </w:tcBorders>
-          </w:tcPr>
-          <w:p>
-            <w:r>
-              <w:t>[[BIRTH_ID_41]]</w:t>
+              <w:t>JUDr.</w:t>
+            </w:r>
+          </w:p>
+        </w:tc>
+        <w:tc>
+          <w:tcPr>
+            <w:tcW w:type="dxa" w:w="3000"/>
+            <w:tcBorders>
+              <w:top w:val="single" w:color="999999" w:sz="1"/>
+              <w:left w:val="single" w:color="999999" w:sz="1"/>
+              <w:bottom w:val="single" w:color="999999" w:sz="1"/>
+              <w:right w:val="single" w:color="999999" w:sz="1"/>
+            </w:tcBorders>
+          </w:tcPr>
+          <w:p>
+            <w:r>
+              <w:t>[[BIRTH_ID_43]]</w:t>
             </w:r>
           </w:p>
         </w:tc>
@@ -464,23 +464,23 @@
           </w:tcPr>
           <w:p>
             <w:r>
-              <w:t>Bc. [[PERSON_48]]</w:t>
-            </w:r>
-          </w:p>
-        </w:tc>
-        <w:tc>
-          <w:tcPr>
-            <w:tcW w:type="dxa" w:w="3000"/>
-            <w:tcBorders>
-              <w:top w:val="single" w:color="999999" w:sz="1"/>
-              <w:left w:val="single" w:color="999999" w:sz="1"/>
-              <w:bottom w:val="single" w:color="999999" w:sz="1"/>
-              <w:right w:val="single" w:color="999999" w:sz="1"/>
-            </w:tcBorders>
-          </w:tcPr>
-          <w:p>
-            <w:r>
-              <w:t>[[BIRTH_ID_42]]</w:t>
+              <w:t>Bc.</w:t>
+            </w:r>
+          </w:p>
+        </w:tc>
+        <w:tc>
+          <w:tcPr>
+            <w:tcW w:type="dxa" w:w="3000"/>
+            <w:tcBorders>
+              <w:top w:val="single" w:color="999999" w:sz="1"/>
+              <w:left w:val="single" w:color="999999" w:sz="1"/>
+              <w:bottom w:val="single" w:color="999999" w:sz="1"/>
+              <w:right w:val="single" w:color="999999" w:sz="1"/>
+            </w:tcBorders>
+          </w:tcPr>
+          <w:p>
+            <w:r>
+              <w:t>[[BIRTH_ID_44]]</w:t>
             </w:r>
           </w:p>
         </w:tc>
@@ -514,23 +514,23 @@
           </w:tcPr>
           <w:p>
             <w:r>
-              <w:t>PhDr. [[PERSON_49]]</w:t>
-            </w:r>
-          </w:p>
-        </w:tc>
-        <w:tc>
-          <w:tcPr>
-            <w:tcW w:type="dxa" w:w="3000"/>
-            <w:tcBorders>
-              <w:top w:val="single" w:color="999999" w:sz="1"/>
-              <w:left w:val="single" w:color="999999" w:sz="1"/>
-              <w:bottom w:val="single" w:color="999999" w:sz="1"/>
-              <w:right w:val="single" w:color="999999" w:sz="1"/>
-            </w:tcBorders>
-          </w:tcPr>
-          <w:p>
-            <w:r>
-              <w:t>[[BIRTH_ID_30]]</w:t>
+              <w:t>PhDr.</w:t>
+            </w:r>
+          </w:p>
+        </w:tc>
+        <w:tc>
+          <w:tcPr>
+            <w:tcW w:type="dxa" w:w="3000"/>
+            <w:tcBorders>
+              <w:top w:val="single" w:color="999999" w:sz="1"/>
+              <w:left w:val="single" w:color="999999" w:sz="1"/>
+              <w:bottom w:val="single" w:color="999999" w:sz="1"/>
+              <w:right w:val="single" w:color="999999" w:sz="1"/>
+            </w:tcBorders>
+          </w:tcPr>
+          <w:p>
+            <w:r>
+              <w:t>[[BIRTH_ID_32]]</w:t>
             </w:r>
           </w:p>
         </w:tc>
@@ -564,23 +564,23 @@
           </w:tcPr>
           <w:p>
             <w:r>
-              <w:t>Mgr. [[PERSON_50]]</w:t>
-            </w:r>
-          </w:p>
-        </w:tc>
-        <w:tc>
-          <w:tcPr>
-            <w:tcW w:type="dxa" w:w="3000"/>
-            <w:tcBorders>
-              <w:top w:val="single" w:color="999999" w:sz="1"/>
-              <w:left w:val="single" w:color="999999" w:sz="1"/>
-              <w:bottom w:val="single" w:color="999999" w:sz="1"/>
-              <w:right w:val="single" w:color="999999" w:sz="1"/>
-            </w:tcBorders>
-          </w:tcPr>
-          <w:p>
-            <w:r>
-              <w:t>[[BIRTH_ID_43]]</w:t>
+              <w:t>Mgr.</w:t>
+            </w:r>
+          </w:p>
+        </w:tc>
+        <w:tc>
+          <w:tcPr>
+            <w:tcW w:type="dxa" w:w="3000"/>
+            <w:tcBorders>
+              <w:top w:val="single" w:color="999999" w:sz="1"/>
+              <w:left w:val="single" w:color="999999" w:sz="1"/>
+              <w:bottom w:val="single" w:color="999999" w:sz="1"/>
+              <w:right w:val="single" w:color="999999" w:sz="1"/>
+            </w:tcBorders>
+          </w:tcPr>
+          <w:p>
+            <w:r>
+              <w:t>[[BIRTH_ID_45]]</w:t>
             </w:r>
           </w:p>
         </w:tc>
@@ -596,7 +596,7 @@
           </w:tcPr>
           <w:p>
             <w:r>
-              <w:t xml:space="preserve">Učitel, ZŠ Pardubice</w:t>
+              <w:t>Učitel, ZŠ [[ADDRESS_16]]</w:t>
             </w:r>
           </w:p>
         </w:tc>
@@ -630,7 +630,7 @@
           </w:tcPr>
           <w:p>
             <w:r>
-              <w:t>[[BIRTH_ID_44]]</w:t>
+              <w:t>[[BIRTH_ID_46]]</w:t>
             </w:r>
           </w:p>
         </w:tc>
@@ -646,7 +646,7 @@
           </w:tcPr>
           <w:p>
             <w:r>
-              <w:t xml:space="preserve">Profesor, UK Praha</w:t>
+              <w:t>Profesor, UK [[ADDRESS_15]]</w:t>
             </w:r>
           </w:p>
         </w:tc>
@@ -664,23 +664,23 @@
           </w:tcPr>
           <w:p>
             <w:r>
-              <w:t>Ing. [[PERSON_52]], MBA</w:t>
-            </w:r>
-          </w:p>
-        </w:tc>
-        <w:tc>
-          <w:tcPr>
-            <w:tcW w:type="dxa" w:w="3000"/>
-            <w:tcBorders>
-              <w:top w:val="single" w:color="999999" w:sz="1"/>
-              <w:left w:val="single" w:color="999999" w:sz="1"/>
-              <w:bottom w:val="single" w:color="999999" w:sz="1"/>
-              <w:right w:val="single" w:color="999999" w:sz="1"/>
-            </w:tcBorders>
-          </w:tcPr>
-          <w:p>
-            <w:r>
-              <w:t>[[BIRTH_ID_45]]</w:t>
+              <w:t>Ing. , MBA</w:t>
+            </w:r>
+          </w:p>
+        </w:tc>
+        <w:tc>
+          <w:tcPr>
+            <w:tcW w:type="dxa" w:w="3000"/>
+            <w:tcBorders>
+              <w:top w:val="single" w:color="999999" w:sz="1"/>
+              <w:left w:val="single" w:color="999999" w:sz="1"/>
+              <w:bottom w:val="single" w:color="999999" w:sz="1"/>
+              <w:right w:val="single" w:color="999999" w:sz="1"/>
+            </w:tcBorders>
+          </w:tcPr>
+          <w:p>
+            <w:r>
+              <w:t>[[BIRTH_ID_47]]</w:t>
             </w:r>
           </w:p>
         </w:tc>
@@ -714,23 +714,23 @@
           </w:tcPr>
           <w:p>
             <w:r>
-              <w:t xml:space="preserve">DiS. Radana Malá</w:t>
-            </w:r>
-          </w:p>
-        </w:tc>
-        <w:tc>
-          <w:tcPr>
-            <w:tcW w:type="dxa" w:w="3000"/>
-            <w:tcBorders>
-              <w:top w:val="single" w:color="999999" w:sz="1"/>
-              <w:left w:val="single" w:color="999999" w:sz="1"/>
-              <w:bottom w:val="single" w:color="999999" w:sz="1"/>
-              <w:right w:val="single" w:color="999999" w:sz="1"/>
-            </w:tcBorders>
-          </w:tcPr>
-          <w:p>
-            <w:r>
-              <w:t>[[BIRTH_ID_46]]</w:t>
+              <w:t>DiS.</w:t>
+            </w:r>
+          </w:p>
+        </w:tc>
+        <w:tc>
+          <w:tcPr>
+            <w:tcW w:type="dxa" w:w="3000"/>
+            <w:tcBorders>
+              <w:top w:val="single" w:color="999999" w:sz="1"/>
+              <w:left w:val="single" w:color="999999" w:sz="1"/>
+              <w:bottom w:val="single" w:color="999999" w:sz="1"/>
+              <w:right w:val="single" w:color="999999" w:sz="1"/>
+            </w:tcBorders>
+          </w:tcPr>
+          <w:p>
+            <w:r>
+              <w:t>[[BIRTH_ID_48]]</w:t>
             </w:r>
           </w:p>
         </w:tc>
@@ -746,7 +746,7 @@
           </w:tcPr>
           <w:p>
             <w:r>
-              <w:t xml:space="preserve">Zdravotní sestra, VFN Praha</w:t>
+              <w:t>Zdravotní sestra, VFN [[ADDRESS_15]]</w:t>
             </w:r>
           </w:p>
         </w:tc>
@@ -764,23 +764,23 @@
           </w:tcPr>
           <w:p>
             <w:r>
-              <w:t>doc. MUDr. [[PERSON_53]], Ph.D.</w:t>
-            </w:r>
-          </w:p>
-        </w:tc>
-        <w:tc>
-          <w:tcPr>
-            <w:tcW w:type="dxa" w:w="3000"/>
-            <w:tcBorders>
-              <w:top w:val="single" w:color="999999" w:sz="1"/>
-              <w:left w:val="single" w:color="999999" w:sz="1"/>
-              <w:bottom w:val="single" w:color="999999" w:sz="1"/>
-              <w:right w:val="single" w:color="999999" w:sz="1"/>
-            </w:tcBorders>
-          </w:tcPr>
-          <w:p>
-            <w:r>
-              <w:t>[[BIRTH_ID_47]]</w:t>
+              <w:t>doc. MUDr. , Ph.D.</w:t>
+            </w:r>
+          </w:p>
+        </w:tc>
+        <w:tc>
+          <w:tcPr>
+            <w:tcW w:type="dxa" w:w="3000"/>
+            <w:tcBorders>
+              <w:top w:val="single" w:color="999999" w:sz="1"/>
+              <w:left w:val="single" w:color="999999" w:sz="1"/>
+              <w:bottom w:val="single" w:color="999999" w:sz="1"/>
+              <w:right w:val="single" w:color="999999" w:sz="1"/>
+            </w:tcBorders>
+          </w:tcPr>
+          <w:p>
+            <w:r>
+              <w:t>[[BIRTH_ID_49]]</w:t>
             </w:r>
           </w:p>
         </w:tc>
@@ -796,7 +796,7 @@
           </w:tcPr>
           <w:p>
             <w:r>
-              <w:t xml:space="preserve">Docent, FN Brno, ČLK: 90123</w:t>
+              <w:t>Docent, FN [[ADDRESS_17]], ČLK: 90123</w:t>
             </w:r>
           </w:p>
         </w:tc>
@@ -820,23 +820,23 @@
         <w:spacing w:before="50" w:after="30"/>
       </w:pPr>
       <w:r>
-        <w:t>• Obviněná [[PERSON_24]] ([[BIRTH_ID_22]]) - stíhána pro podvod, vazba</w:t>
-      </w:r>
-    </w:p>
-    <w:p>
-      <w:pPr>
-        <w:spacing w:before="30" w:after="30"/>
-      </w:pPr>
-      <w:r>
-        <w:t>• Dlužnice [[PERSON_25]] ([[BIRTH_ID_23]], [[BANK_5]]) - dluh 847 600 Kč, 7 exekucí</w:t>
-      </w:r>
-    </w:p>
-    <w:p>
-      <w:pPr>
-        <w:spacing w:before="30" w:after="30"/>
-      </w:pPr>
-      <w:r>
-        <w:t>• Pacientka Ing. [[PERSON_26]] ([[BIRTH_ID_24]], [[PHONE_2]]) - léčba rakoviny vaječníků C56.9</w:t>
+        <w:t>• Obviněná [[PERSON_24]] ([[BIRTH_ID_23]]) - stíhána pro podvod, vazba</w:t>
+      </w:r>
+    </w:p>
+    <w:p>
+      <w:pPr>
+        <w:spacing w:before="30" w:after="30"/>
+      </w:pPr>
+      <w:r>
+        <w:t>• Dlužnice [[PERSON_25]] ([[BIRTH_ID_24]], [[BANK_5]]) - dluh 847 600 Kč, 7 exekucí</w:t>
+      </w:r>
+    </w:p>
+    <w:p>
+      <w:pPr>
+        <w:spacing w:before="30" w:after="30"/>
+      </w:pPr>
+      <w:r>
+        <w:t>• Pacientka Ing. [[PERSON_26]] ([[BIRTH_ID_25]], [[PHONE_2]]) - léčba rakoviny vaječníků C56.9</w:t>
       </w:r>
     </w:p>
     <w:p>
@@ -852,127 +852,127 @@
         <w:spacing w:before="30" w:after="30"/>
       </w:pPr>
       <w:r>
-        <w:t>• Žadatelka [[PERSON_28]] ([[BIRTH_ID_25]]) - příspěvek na bydlení 6 800 Kč, 3 děti</w:t>
-      </w:r>
-    </w:p>
-    <w:p>
-      <w:pPr>
-        <w:spacing w:before="30" w:after="30"/>
-      </w:pPr>
-      <w:r>
-        <w:t>• Odsouzený [[PERSON_29]] ([[BIRTH_ID_26]]) - trest 6 let za zpronevěru, VÚ Valdice</w:t>
-      </w:r>
-    </w:p>
-    <w:p>
-      <w:pPr>
-        <w:spacing w:before="30" w:after="30"/>
-      </w:pPr>
-      <w:r>
-        <w:t>• Věřitel Mgr. [[PERSON_30]] ([[BIRTH_ID_27]], [[ICO_3]]) - pohledávka 340 000 Kč</w:t>
-      </w:r>
-    </w:p>
-    <w:p>
-      <w:pPr>
-        <w:spacing w:before="30" w:after="30"/>
-      </w:pPr>
-      <w:r>
-        <w:t>• Pojištěnka PhDr. [[PERSON_31]] ([[BIRTH_ID_28]], číslo pojištěnce VZP[[PHONE_10]]) - hospitalizace pro pneumonii</w:t>
-      </w:r>
-    </w:p>
-    <w:p>
-      <w:pPr>
-        <w:spacing w:before="30" w:after="30"/>
-      </w:pPr>
-      <w:r>
-        <w:t>• Kupující Ing. [[PERSON_32]], MBA ([[BIRTH_ID_29]]) - koupě bytu 3+1 za 4 850 000 Kč</w:t>
-      </w:r>
-    </w:p>
-    <w:p>
-      <w:pPr>
-        <w:spacing w:before="30" w:after="30"/>
-      </w:pPr>
-      <w:r>
-        <w:t>• Investor JUDr. [[PERSON_33]] ([[BIRTH_ID_30]], email: [[EMAIL_7]]) - portfolio 8 400 000 Kč</w:t>
-      </w:r>
-    </w:p>
-    <w:p>
-      <w:pPr>
-        <w:spacing w:before="30" w:after="30"/>
-      </w:pPr>
-      <w:r>
-        <w:t>• Manželka Mgr. [[PERSON_34]] ([[BIRTH_ID_31]]) - ručitelka hypotéky, [[BANK_6]]</w:t>
-      </w:r>
-    </w:p>
-    <w:p>
-      <w:pPr>
-        <w:spacing w:before="30" w:after="30"/>
-      </w:pPr>
-      <w:r>
-        <w:t>• Rodič Bc. [[PERSON_35]] ([[BIRTH_ID_32]]) - plátce výživného 11 500 Kč na dva syny</w:t>
-      </w:r>
-    </w:p>
-    <w:p>
-      <w:pPr>
-        <w:spacing w:before="30" w:after="30"/>
-      </w:pPr>
-      <w:r>
-        <w:t>• Důchodce Ing. [[PERSON_36]], CSc. ([[BIRTH_ID_33]]) - starobní důchod 19 800 Kč měsíčně</w:t>
-      </w:r>
-    </w:p>
-    <w:p>
-      <w:pPr>
-        <w:spacing w:before="30" w:after="30"/>
-      </w:pPr>
-      <w:r>
-        <w:t>• Studentka [[PERSON_37]] ([[BIRTH_ID_34]], [[ADDRESS_13]]) - UK Praha, 2. ročník</w:t>
-      </w:r>
-    </w:p>
-    <w:p>
-      <w:pPr>
-        <w:spacing w:before="30" w:after="30"/>
-      </w:pPr>
-      <w:r>
-        <w:t>• Absolvent Mgr. [[PERSON_38]] ([[BIRTH_ID_35]]) - hledá zaměstnání, uchazeč o pozici analytika</w:t>
-      </w:r>
-    </w:p>
-    <w:p>
-      <w:pPr>
-        <w:spacing w:before="30" w:after="30"/>
-      </w:pPr>
-      <w:r>
-        <w:t>• Svědkyně PharmDr. [[PERSON_39]] ([[BIRTH_ID_36]], [[PHONE_8]]) - výpověď v trestní věci</w:t>
-      </w:r>
-    </w:p>
-    <w:p>
-      <w:pPr>
-        <w:spacing w:before="30" w:after="30"/>
-      </w:pPr>
-      <w:r>
-        <w:t>• Prodávající Ing. [[PERSON_40]] ([[BIRTH_ID_37]], [[BANK_7]]) - prodej nemovitosti LV 8912</w:t>
-      </w:r>
-    </w:p>
-    <w:p>
-      <w:pPr>
-        <w:spacing w:before="30" w:after="30"/>
-      </w:pPr>
-      <w:r>
-        <w:t>• Uchazečka Bc. [[PERSON_41]] ([[BIRTH_ID_38]], email: [[EMAIL_8]]) - pozice HR specialista</w:t>
-      </w:r>
-    </w:p>
-    <w:p>
-      <w:pPr>
-        <w:spacing w:before="30" w:after="30"/>
-      </w:pPr>
-      <w:r>
-        <w:t>• Pečující [[PERSON_42]] ([[BIRTH_ID_28]]) - péče o matku, příspěvek 9 800 Kč</w:t>
-      </w:r>
-    </w:p>
-    <w:p>
-      <w:pPr>
-        <w:spacing w:before="30" w:after="30"/>
-      </w:pPr>
-      <w:r>
-        <w:t>• Oprávněný JUDr. [[PERSON_43]] ([[BIRTH_ID_39]]) - beneficient pojistky, výše 2 500 000 Kč</w:t>
+        <w:t>• Žadatelka [[PERSON_28]] ([[BIRTH_ID_26]]) - příspěvek na bydlení 6 800 Kč, 3 děti</w:t>
+      </w:r>
+    </w:p>
+    <w:p>
+      <w:pPr>
+        <w:spacing w:before="30" w:after="30"/>
+      </w:pPr>
+      <w:r>
+        <w:t>• Odsouzený [[PERSON_29]] ([[BIRTH_ID_27]]) - trest 6 let za zpronevěru, VÚ Valdice</w:t>
+      </w:r>
+    </w:p>
+    <w:p>
+      <w:pPr>
+        <w:spacing w:before="30" w:after="30"/>
+      </w:pPr>
+      <w:r>
+        <w:t>• Věřitel Mgr. [[PERSON_30]] ([[BIRTH_ID_28]], [[ICO_3]]) - pohledávka 340 000 Kč</w:t>
+      </w:r>
+    </w:p>
+    <w:p>
+      <w:pPr>
+        <w:spacing w:before="30" w:after="30"/>
+      </w:pPr>
+      <w:r>
+        <w:t>• Pojištěnka PhDr. [[PERSON_31]] ([[BIRTH_ID_29]], [[BIRTH_ID_30]]) - hospitalizace pro pneumonii</w:t>
+      </w:r>
+    </w:p>
+    <w:p>
+      <w:pPr>
+        <w:spacing w:before="30" w:after="30"/>
+      </w:pPr>
+      <w:r>
+        <w:t>• Kupující Ing. [[PERSON_32]], MBA ([[BIRTH_ID_31]]) - koupě bytu 3+1 za 4 850 000 Kč</w:t>
+      </w:r>
+    </w:p>
+    <w:p>
+      <w:pPr>
+        <w:spacing w:before="30" w:after="30"/>
+      </w:pPr>
+      <w:r>
+        <w:t>• Investor JUDr. [[PERSON_33]] ([[BIRTH_ID_32]], email: [[EMAIL_7]]) - portfolio 8 400 000 Kč</w:t>
+      </w:r>
+    </w:p>
+    <w:p>
+      <w:pPr>
+        <w:spacing w:before="30" w:after="30"/>
+      </w:pPr>
+      <w:r>
+        <w:t>• Manželka Mgr. [[PERSON_34]] ([[BIRTH_ID_33]]) - ručitelka hypotéky, [[BANK_6]]</w:t>
+      </w:r>
+    </w:p>
+    <w:p>
+      <w:pPr>
+        <w:spacing w:before="30" w:after="30"/>
+      </w:pPr>
+      <w:r>
+        <w:t>• Rodič Bc. [[PERSON_35]] ([[BIRTH_ID_34]]) - plátce výživného 11 500 Kč na dva syny</w:t>
+      </w:r>
+    </w:p>
+    <w:p>
+      <w:pPr>
+        <w:spacing w:before="30" w:after="30"/>
+      </w:pPr>
+      <w:r>
+        <w:t>• Důchodce Ing. [[PERSON_36]], CSc. ([[BIRTH_ID_35]]) - starobní důchod 19 800 Kč měsíčně</w:t>
+      </w:r>
+    </w:p>
+    <w:p>
+      <w:pPr>
+        <w:spacing w:before="30" w:after="30"/>
+      </w:pPr>
+      <w:r>
+        <w:t>• Studentka [[PERSON_37]] ([[BIRTH_ID_36]], [[ADDRESS_14]]) - UK [[ADDRESS_15]], 2. ročník</w:t>
+      </w:r>
+    </w:p>
+    <w:p>
+      <w:pPr>
+        <w:spacing w:before="30" w:after="30"/>
+      </w:pPr>
+      <w:r>
+        <w:t>• Absolvent Mgr. [[PERSON_38]] ([[BIRTH_ID_37]]) - hledá zaměstnání, uchazeč o pozici analytika</w:t>
+      </w:r>
+    </w:p>
+    <w:p>
+      <w:pPr>
+        <w:spacing w:before="30" w:after="30"/>
+      </w:pPr>
+      <w:r>
+        <w:t>• Svědkyně PharmDr. [[PERSON_39]] ([[BIRTH_ID_38]], [[PHONE_7]]) - výpověď v trestní věci</w:t>
+      </w:r>
+    </w:p>
+    <w:p>
+      <w:pPr>
+        <w:spacing w:before="30" w:after="30"/>
+      </w:pPr>
+      <w:r>
+        <w:t>• Prodávající Ing. [[PERSON_40]] ([[BIRTH_ID_39]], [[BANK_7]]) - prodej nemovitosti LV 8912</w:t>
+      </w:r>
+    </w:p>
+    <w:p>
+      <w:pPr>
+        <w:spacing w:before="30" w:after="30"/>
+      </w:pPr>
+      <w:r>
+        <w:t>• Uchazečka Bc. [[PERSON_41]] ([[BIRTH_ID_40]], email: [[EMAIL_8]]) - pozice HR specialista</w:t>
+      </w:r>
+    </w:p>
+    <w:p>
+      <w:pPr>
+        <w:spacing w:before="30" w:after="30"/>
+      </w:pPr>
+      <w:r>
+        <w:t>• Pečující [[PERSON_42]] ([[BIRTH_ID_29]]) - péče o matku, příspěvek 9 800 Kč</w:t>
+      </w:r>
+    </w:p>
+    <w:p>
+      <w:pPr>
+        <w:spacing w:before="30" w:after="30"/>
+      </w:pPr>
+      <w:r>
+        <w:t>• Oprávněný JUDr. [[PERSON_43]] ([[BIRTH_ID_41]]) - beneficient pojistky, výše 2 500 000 Kč</w:t>
       </w:r>
     </w:p>
     <w:p>
@@ -980,7 +980,7 @@
         <w:spacing w:before="30" w:after="240"/>
       </w:pPr>
       <w:r>
-        <w:t>• Kontrolovaná Mgr. [[PERSON_44]] ([[BIRTH_ID_29]], [[ICO_4]]) - finanční audit za rok 2025</w:t>
+        <w:t>• Kontrolovaná Mgr. [[PERSON_44]] ([[BIRTH_ID_31]], [[ICO_4]]) - finanční audit za rok 2025</w:t>
       </w:r>
     </w:p>
     <w:p>
@@ -1064,7 +1064,7 @@
         <w:spacing w:before="30" w:after="100"/>
       </w:pPr>
       <w:r>
-        <w:t xml:space="preserve">✓ Vzácná jména: Xaver, Anastázie, Kliment, Pravoslav, Květoslav</w:t>
+        <w:t>✓ Vzácná jména: [[PERSON_51]], [[PERSON_28]], [[PERSON_29]], [[PERSON_45]], [[PERSON_27]]</w:t>
       </w:r>
     </w:p>
     <w:p>

</xml_diff>

<commit_message>
anon72: address prefix stripping, full person audit, docs update
- anon72: strip 'adrese', 'bytem' from ADDRESS map values
- anon72: blacklist updates (Rodinný dům, sídlem, Exekutorský úřad)
- anon72: fix 17. listopadu as date vs street name
- anon72: Václavské nám. pre-pass, Zíka/Zíký surname inference
- Add _full_person_audit.py (like _full_addr_audit for PERSON entries)
- Update FINAL_AUDIT_SUMMARY, TECHNICAL_DOCUMENTATION, SKRYI_TECHNICAL_DOCUMENTATION
- Re-anonymized test outputs, removed obsolete debug scripts

Made-with: Cursor
</commit_message>
<xml_diff>
--- a/test_data/smlouva 30_anon.docx
+++ b/test_data/smlouva 30_anon.docx
@@ -364,7 +364,7 @@
           </w:tcPr>
           <w:p>
             <w:r>
-              <w:t>MUDr.</w:t>
+              <w:t>MUDr. [[PERSON_46]]</w:t>
             </w:r>
           </w:p>
         </w:tc>
@@ -414,7 +414,7 @@
           </w:tcPr>
           <w:p>
             <w:r>
-              <w:t>JUDr.</w:t>
+              <w:t>JUDr. [[PERSON_47]]</w:t>
             </w:r>
           </w:p>
         </w:tc>
@@ -464,7 +464,7 @@
           </w:tcPr>
           <w:p>
             <w:r>
-              <w:t>Bc.</w:t>
+              <w:t>Bc. [[PERSON_48]]</w:t>
             </w:r>
           </w:p>
         </w:tc>
@@ -514,7 +514,7 @@
           </w:tcPr>
           <w:p>
             <w:r>
-              <w:t>PhDr.</w:t>
+              <w:t>PhDr. [[PERSON_49]]</w:t>
             </w:r>
           </w:p>
         </w:tc>
@@ -564,7 +564,7 @@
           </w:tcPr>
           <w:p>
             <w:r>
-              <w:t>Mgr.</w:t>
+              <w:t>Mgr. [[PERSON_50]]</w:t>
             </w:r>
           </w:p>
         </w:tc>
@@ -596,7 +596,7 @@
           </w:tcPr>
           <w:p>
             <w:r>
-              <w:t>Učitel, ZŠ [[ADDRESS_16]]</w:t>
+              <w:t xml:space="preserve">Učitel, ZŠ Pardubice</w:t>
             </w:r>
           </w:p>
         </w:tc>
@@ -646,7 +646,7 @@
           </w:tcPr>
           <w:p>
             <w:r>
-              <w:t>Profesor, UK [[ADDRESS_15]]</w:t>
+              <w:t xml:space="preserve">Profesor, UK Praha</w:t>
             </w:r>
           </w:p>
         </w:tc>
@@ -664,7 +664,7 @@
           </w:tcPr>
           <w:p>
             <w:r>
-              <w:t>Ing. , MBA</w:t>
+              <w:t>Ing. [[PERSON_52]], MBA</w:t>
             </w:r>
           </w:p>
         </w:tc>
@@ -714,7 +714,7 @@
           </w:tcPr>
           <w:p>
             <w:r>
-              <w:t>DiS.</w:t>
+              <w:t>DiS. [[PERSON_53]]</w:t>
             </w:r>
           </w:p>
         </w:tc>
@@ -746,7 +746,7 @@
           </w:tcPr>
           <w:p>
             <w:r>
-              <w:t>Zdravotní sestra, VFN [[ADDRESS_15]]</w:t>
+              <w:t xml:space="preserve">Zdravotní sestra, VFN Praha</w:t>
             </w:r>
           </w:p>
         </w:tc>
@@ -764,7 +764,7 @@
           </w:tcPr>
           <w:p>
             <w:r>
-              <w:t>doc. MUDr. , Ph.D.</w:t>
+              <w:t>doc. MUDr. [[PERSON_54]], Ph.D.</w:t>
             </w:r>
           </w:p>
         </w:tc>
@@ -796,7 +796,7 @@
           </w:tcPr>
           <w:p>
             <w:r>
-              <w:t>Docent, FN [[ADDRESS_17]], ČLK: 90123</w:t>
+              <w:t xml:space="preserve">Docent, FN Brno, ČLK: 90123</w:t>
             </w:r>
           </w:p>
         </w:tc>
@@ -924,7 +924,7 @@
         <w:spacing w:before="30" w:after="30"/>
       </w:pPr>
       <w:r>
-        <w:t>• Studentka [[PERSON_37]] ([[BIRTH_ID_36]], [[ADDRESS_14]]) - UK [[ADDRESS_15]], 2. ročník</w:t>
+        <w:t>• Studentka [[PERSON_37]] ([[BIRTH_ID_36]], [[ADDRESS_14]], 2. ročník</w:t>
       </w:r>
     </w:p>
     <w:p>
@@ -948,7 +948,7 @@
         <w:spacing w:before="30" w:after="30"/>
       </w:pPr>
       <w:r>
-        <w:t>• Prodávající Ing. [[PERSON_40]] ([[BIRTH_ID_39]], [[BANK_7]]) - prodej nemovitosti LV 8912</w:t>
+        <w:t>• Prodávající Ing. [[PERSON_40]] ([[BIRTH_ID_39]], [[BANK_7]]) - prodej nemovitosti [[LICENSE_PLATE_1]]</w:t>
       </w:r>
     </w:p>
     <w:p>
@@ -1112,6 +1112,12 @@
       </w:r>
     </w:p>
     <w:sectPr>
+      <w:headerReference w:type="default" r:id="rId7"/>
+      <w:footerReference w:type="default" r:id="rId8"/>
+      <w:headerReference w:type="first" r:id="rId9"/>
+      <w:footerReference w:type="first" r:id="rId10"/>
+      <w:headerReference w:type="even" r:id="rId11"/>
+      <w:footerReference w:type="even" r:id="rId12"/>
       <w:pgSz w:w="11906" w:h="16838" w:orient="portrait"/>
       <w:pgMar w:top="1440" w:right="1440" w:bottom="1440" w:left="1440" w:header="708" w:footer="708" w:gutter="0"/>
       <w:pgNumType/>
@@ -1125,6 +1131,36 @@
 <w:comments xmlns:cx="http://schemas.microsoft.com/office/drawing/2014/chartex" xmlns:cx1="http://schemas.microsoft.com/office/drawing/2015/9/8/chartex" xmlns:cx2="http://schemas.microsoft.com/office/drawing/2015/10/21/chartex" xmlns:cx3="http://schemas.microsoft.com/office/drawing/2016/5/9/chartex" xmlns:cx4="http://schemas.microsoft.com/office/drawing/2016/5/10/chartex" xmlns:cx5="http://schemas.microsoft.com/office/drawing/2016/5/11/chartex" xmlns:cx6="http://schemas.microsoft.com/office/drawing/2016/5/12/chartex" xmlns:cx7="http://schemas.microsoft.com/office/drawing/2016/5/13/chartex" xmlns:cx8="http://schemas.microsoft.com/office/drawing/2016/5/14/chartex" xmlns:mc="http://schemas.openxmlformats.org/markup-compatibility/2006" xmlns:aink="http://schemas.microsoft.com/office/drawing/2016/ink" xmlns:am3d="http://schemas.microsoft.com/office/drawing/2017/model3d" xmlns:o="urn:schemas-microsoft-com:office:office" xmlns:r="http://schemas.openxmlformats.org/officeDocument/2006/relationships" xmlns:m="http://schemas.openxmlformats.org/officeDocument/2006/math" xmlns:v="urn:schemas-microsoft-com:vml" xmlns:wp14="http://schemas.microsoft.com/office/word/2010/wordprocessingDrawing" xmlns:wp="http://schemas.openxmlformats.org/drawingml/2006/wordprocessingDrawing" xmlns:w10="urn:schemas-microsoft-com:office:word" xmlns:w="http://schemas.openxmlformats.org/wordprocessingml/2006/main" xmlns:w14="http://schemas.microsoft.com/office/word/2010/wordml" xmlns:w15="http://schemas.microsoft.com/office/word/2012/wordml" xmlns:w16cex="http://schemas.microsoft.com/office/word/2018/wordml/cex" xmlns:w16cid="http://schemas.microsoft.com/office/word/2016/wordml/cid" xmlns:w16="http://schemas.microsoft.com/office/word/2018/wordml" xmlns:w16sdtdh="http://schemas.microsoft.com/office/word/2020/wordml/sdtdatahash" xmlns:w16se="http://schemas.microsoft.com/office/word/2015/wordml/symex" xmlns:wpg="http://schemas.microsoft.com/office/word/2010/wordprocessingGroup" xmlns:wpi="http://schemas.microsoft.com/office/word/2010/wordprocessingInk" xmlns:wne="http://schemas.microsoft.com/office/word/2006/wordml" xmlns:wps="http://schemas.microsoft.com/office/word/2010/wordprocessingShape"/>
 </file>
 
+<file path=word/footer1.xml><?xml version="1.0" encoding="utf-8"?>
+<w:ftr xmlns:m="http://schemas.openxmlformats.org/officeDocument/2006/math" xmlns:mc="http://schemas.openxmlformats.org/markup-compatibility/2006" xmlns:mo="http://schemas.microsoft.com/office/mac/office/2008/main" xmlns:mv="urn:schemas-microsoft-com:mac:vml" xmlns:o="urn:schemas-microsoft-com:office:office" xmlns:r="http://schemas.openxmlformats.org/officeDocument/2006/relationships" xmlns:v="urn:schemas-microsoft-com:vml" xmlns:w10="urn:schemas-microsoft-com:office:word" xmlns:w14="http://schemas.microsoft.com/office/word/2010/wordml" xmlns:w="http://schemas.openxmlformats.org/wordprocessingml/2006/main" xmlns:wne="http://schemas.microsoft.com/office/word/2006/wordml" xmlns:wp14="http://schemas.microsoft.com/office/word/2010/wordprocessingDrawing" xmlns:wp="http://schemas.openxmlformats.org/drawingml/2006/wordprocessingDrawing" xmlns:wpc="http://schemas.microsoft.com/office/word/2010/wordprocessingCanvas" xmlns:wpg="http://schemas.microsoft.com/office/word/2010/wordprocessingGroup" xmlns:wpi="http://schemas.microsoft.com/office/word/2010/wordprocessingInk" xmlns:wps="http://schemas.microsoft.com/office/word/2010/wordprocessingShape" mc:Ignorable="w14 wp14">
+  <w:p>
+    <w:pPr>
+      <w:pStyle w:val="Footer"/>
+    </w:pPr>
+  </w:p>
+</w:ftr>
+</file>
+
+<file path=word/footer2.xml><?xml version="1.0" encoding="utf-8"?>
+<w:ftr xmlns:m="http://schemas.openxmlformats.org/officeDocument/2006/math" xmlns:mc="http://schemas.openxmlformats.org/markup-compatibility/2006" xmlns:mo="http://schemas.microsoft.com/office/mac/office/2008/main" xmlns:mv="urn:schemas-microsoft-com:mac:vml" xmlns:o="urn:schemas-microsoft-com:office:office" xmlns:r="http://schemas.openxmlformats.org/officeDocument/2006/relationships" xmlns:v="urn:schemas-microsoft-com:vml" xmlns:w10="urn:schemas-microsoft-com:office:word" xmlns:w14="http://schemas.microsoft.com/office/word/2010/wordml" xmlns:w="http://schemas.openxmlformats.org/wordprocessingml/2006/main" xmlns:wne="http://schemas.microsoft.com/office/word/2006/wordml" xmlns:wp14="http://schemas.microsoft.com/office/word/2010/wordprocessingDrawing" xmlns:wp="http://schemas.openxmlformats.org/drawingml/2006/wordprocessingDrawing" xmlns:wpc="http://schemas.microsoft.com/office/word/2010/wordprocessingCanvas" xmlns:wpg="http://schemas.microsoft.com/office/word/2010/wordprocessingGroup" xmlns:wpi="http://schemas.microsoft.com/office/word/2010/wordprocessingInk" xmlns:wps="http://schemas.microsoft.com/office/word/2010/wordprocessingShape" mc:Ignorable="w14 wp14">
+  <w:p>
+    <w:pPr>
+      <w:pStyle w:val="Footer"/>
+    </w:pPr>
+  </w:p>
+</w:ftr>
+</file>
+
+<file path=word/footer3.xml><?xml version="1.0" encoding="utf-8"?>
+<w:ftr xmlns:m="http://schemas.openxmlformats.org/officeDocument/2006/math" xmlns:mc="http://schemas.openxmlformats.org/markup-compatibility/2006" xmlns:mo="http://schemas.microsoft.com/office/mac/office/2008/main" xmlns:mv="urn:schemas-microsoft-com:mac:vml" xmlns:o="urn:schemas-microsoft-com:office:office" xmlns:r="http://schemas.openxmlformats.org/officeDocument/2006/relationships" xmlns:v="urn:schemas-microsoft-com:vml" xmlns:w10="urn:schemas-microsoft-com:office:word" xmlns:w14="http://schemas.microsoft.com/office/word/2010/wordml" xmlns:w="http://schemas.openxmlformats.org/wordprocessingml/2006/main" xmlns:wne="http://schemas.microsoft.com/office/word/2006/wordml" xmlns:wp14="http://schemas.microsoft.com/office/word/2010/wordprocessingDrawing" xmlns:wp="http://schemas.openxmlformats.org/drawingml/2006/wordprocessingDrawing" xmlns:wpc="http://schemas.microsoft.com/office/word/2010/wordprocessingCanvas" xmlns:wpg="http://schemas.microsoft.com/office/word/2010/wordprocessingGroup" xmlns:wpi="http://schemas.microsoft.com/office/word/2010/wordprocessingInk" xmlns:wps="http://schemas.microsoft.com/office/word/2010/wordprocessingShape" mc:Ignorable="w14 wp14">
+  <w:p>
+    <w:pPr>
+      <w:pStyle w:val="Footer"/>
+    </w:pPr>
+  </w:p>
+</w:ftr>
+</file>
+
 <file path=word/footnotes.xml><?xml version="1.0" encoding="utf-8"?>
 <w:footnotes xmlns:wpc="http://schemas.microsoft.com/office/word/2010/wordprocessingCanvas" xmlns:mc="http://schemas.openxmlformats.org/markup-compatibility/2006" xmlns:o="urn:schemas-microsoft-com:office:office" xmlns:r="http://schemas.openxmlformats.org/officeDocument/2006/relationships" xmlns:m="http://schemas.openxmlformats.org/officeDocument/2006/math" xmlns:v="urn:schemas-microsoft-com:vml" xmlns:wp14="http://schemas.microsoft.com/office/word/2010/wordprocessingDrawing" xmlns:wp="http://schemas.openxmlformats.org/drawingml/2006/wordprocessingDrawing" xmlns:w10="urn:schemas-microsoft-com:office:word" xmlns:w="http://schemas.openxmlformats.org/wordprocessingml/2006/main" xmlns:w14="http://schemas.microsoft.com/office/word/2010/wordml" xmlns:w15="http://schemas.microsoft.com/office/word/2012/wordml" xmlns:wpg="http://schemas.microsoft.com/office/word/2010/wordprocessingGroup" xmlns:wpi="http://schemas.microsoft.com/office/word/2010/wordprocessingInk" xmlns:wne="http://schemas.microsoft.com/office/word/2006/wordml" xmlns:wps="http://schemas.microsoft.com/office/word/2010/wordprocessingShape" mc:Ignorable="w14 w15 wp14">
   <w:footnote w:type="separator" w:id="-1">
@@ -1160,6 +1196,36 @@
     </w:p>
   </w:footnote>
 </w:footnotes>
+</file>
+
+<file path=word/header1.xml><?xml version="1.0" encoding="utf-8"?>
+<w:hdr xmlns:m="http://schemas.openxmlformats.org/officeDocument/2006/math" xmlns:mc="http://schemas.openxmlformats.org/markup-compatibility/2006" xmlns:mo="http://schemas.microsoft.com/office/mac/office/2008/main" xmlns:mv="urn:schemas-microsoft-com:mac:vml" xmlns:o="urn:schemas-microsoft-com:office:office" xmlns:r="http://schemas.openxmlformats.org/officeDocument/2006/relationships" xmlns:v="urn:schemas-microsoft-com:vml" xmlns:w10="urn:schemas-microsoft-com:office:word" xmlns:w14="http://schemas.microsoft.com/office/word/2010/wordml" xmlns:w="http://schemas.openxmlformats.org/wordprocessingml/2006/main" xmlns:wne="http://schemas.microsoft.com/office/word/2006/wordml" xmlns:wp14="http://schemas.microsoft.com/office/word/2010/wordprocessingDrawing" xmlns:wp="http://schemas.openxmlformats.org/drawingml/2006/wordprocessingDrawing" xmlns:wpc="http://schemas.microsoft.com/office/word/2010/wordprocessingCanvas" xmlns:wpg="http://schemas.microsoft.com/office/word/2010/wordprocessingGroup" xmlns:wpi="http://schemas.microsoft.com/office/word/2010/wordprocessingInk" xmlns:wps="http://schemas.microsoft.com/office/word/2010/wordprocessingShape" mc:Ignorable="w14 wp14">
+  <w:p>
+    <w:pPr>
+      <w:pStyle w:val="Header"/>
+    </w:pPr>
+  </w:p>
+</w:hdr>
+</file>
+
+<file path=word/header2.xml><?xml version="1.0" encoding="utf-8"?>
+<w:hdr xmlns:m="http://schemas.openxmlformats.org/officeDocument/2006/math" xmlns:mc="http://schemas.openxmlformats.org/markup-compatibility/2006" xmlns:mo="http://schemas.microsoft.com/office/mac/office/2008/main" xmlns:mv="urn:schemas-microsoft-com:mac:vml" xmlns:o="urn:schemas-microsoft-com:office:office" xmlns:r="http://schemas.openxmlformats.org/officeDocument/2006/relationships" xmlns:v="urn:schemas-microsoft-com:vml" xmlns:w10="urn:schemas-microsoft-com:office:word" xmlns:w14="http://schemas.microsoft.com/office/word/2010/wordml" xmlns:w="http://schemas.openxmlformats.org/wordprocessingml/2006/main" xmlns:wne="http://schemas.microsoft.com/office/word/2006/wordml" xmlns:wp14="http://schemas.microsoft.com/office/word/2010/wordprocessingDrawing" xmlns:wp="http://schemas.openxmlformats.org/drawingml/2006/wordprocessingDrawing" xmlns:wpc="http://schemas.microsoft.com/office/word/2010/wordprocessingCanvas" xmlns:wpg="http://schemas.microsoft.com/office/word/2010/wordprocessingGroup" xmlns:wpi="http://schemas.microsoft.com/office/word/2010/wordprocessingInk" xmlns:wps="http://schemas.microsoft.com/office/word/2010/wordprocessingShape" mc:Ignorable="w14 wp14">
+  <w:p>
+    <w:pPr>
+      <w:pStyle w:val="Header"/>
+    </w:pPr>
+  </w:p>
+</w:hdr>
+</file>
+
+<file path=word/header3.xml><?xml version="1.0" encoding="utf-8"?>
+<w:hdr xmlns:m="http://schemas.openxmlformats.org/officeDocument/2006/math" xmlns:mc="http://schemas.openxmlformats.org/markup-compatibility/2006" xmlns:mo="http://schemas.microsoft.com/office/mac/office/2008/main" xmlns:mv="urn:schemas-microsoft-com:mac:vml" xmlns:o="urn:schemas-microsoft-com:office:office" xmlns:r="http://schemas.openxmlformats.org/officeDocument/2006/relationships" xmlns:v="urn:schemas-microsoft-com:vml" xmlns:w10="urn:schemas-microsoft-com:office:word" xmlns:w14="http://schemas.microsoft.com/office/word/2010/wordml" xmlns:w="http://schemas.openxmlformats.org/wordprocessingml/2006/main" xmlns:wne="http://schemas.microsoft.com/office/word/2006/wordml" xmlns:wp14="http://schemas.microsoft.com/office/word/2010/wordprocessingDrawing" xmlns:wp="http://schemas.openxmlformats.org/drawingml/2006/wordprocessingDrawing" xmlns:wpc="http://schemas.microsoft.com/office/word/2010/wordprocessingCanvas" xmlns:wpg="http://schemas.microsoft.com/office/word/2010/wordprocessingGroup" xmlns:wpi="http://schemas.microsoft.com/office/word/2010/wordprocessingInk" xmlns:wps="http://schemas.microsoft.com/office/word/2010/wordprocessingShape" mc:Ignorable="w14 wp14">
+  <w:p>
+    <w:pPr>
+      <w:pStyle w:val="Header"/>
+    </w:pPr>
+  </w:p>
+</w:hdr>
 </file>
 
 <file path=word/numbering.xml><?xml version="1.0" encoding="utf-8"?>

</xml_diff>

<commit_message>
Plná synchronizace: anon72, dokumentace, test_data, vše z lokálu
</commit_message>
<xml_diff>
--- a/test_data/smlouva 30_anon.docx
+++ b/test_data/smlouva 30_anon.docx
@@ -314,7 +314,7 @@
           </w:tcPr>
           <w:p>
             <w:r>
-              <w:t>Ing. [[PERSON_45]]</w:t>
+              <w:t>Ing. [[PERSON_47]]</w:t>
             </w:r>
           </w:p>
         </w:tc>
@@ -364,7 +364,7 @@
           </w:tcPr>
           <w:p>
             <w:r>
-              <w:t>MUDr. [[PERSON_46]]</w:t>
+              <w:t>MUDr. [[PERSON_48]]</w:t>
             </w:r>
           </w:p>
         </w:tc>
@@ -414,7 +414,7 @@
           </w:tcPr>
           <w:p>
             <w:r>
-              <w:t>JUDr. [[PERSON_47]]</w:t>
+              <w:t>JUDr. [[PERSON_49]]</w:t>
             </w:r>
           </w:p>
         </w:tc>
@@ -464,7 +464,7 @@
           </w:tcPr>
           <w:p>
             <w:r>
-              <w:t>Bc. [[PERSON_48]]</w:t>
+              <w:t>Bc. [[PERSON_50]]</w:t>
             </w:r>
           </w:p>
         </w:tc>
@@ -514,7 +514,7 @@
           </w:tcPr>
           <w:p>
             <w:r>
-              <w:t>PhDr. [[PERSON_49]]</w:t>
+              <w:t>PhDr. [[PERSON_51]]</w:t>
             </w:r>
           </w:p>
         </w:tc>
@@ -564,7 +564,7 @@
           </w:tcPr>
           <w:p>
             <w:r>
-              <w:t>Mgr. [[PERSON_50]]</w:t>
+              <w:t>Mgr. [[PERSON_52]]</w:t>
             </w:r>
           </w:p>
         </w:tc>
@@ -614,7 +614,7 @@
           </w:tcPr>
           <w:p>
             <w:r>
-              <w:t>prof. RNDr. [[PERSON_51]], DrSc.</w:t>
+              <w:t>prof. RNDr. [[PERSON_53]], DrSc.</w:t>
             </w:r>
           </w:p>
         </w:tc>
@@ -664,7 +664,7 @@
           </w:tcPr>
           <w:p>
             <w:r>
-              <w:t>Ing. [[PERSON_52]], MBA</w:t>
+              <w:t>Ing. [[PERSON_54]], MBA</w:t>
             </w:r>
           </w:p>
         </w:tc>
@@ -714,7 +714,7 @@
           </w:tcPr>
           <w:p>
             <w:r>
-              <w:t>DiS. [[PERSON_53]]</w:t>
+              <w:t>DiS. [[PERSON_55]]</w:t>
             </w:r>
           </w:p>
         </w:tc>
@@ -764,7 +764,7 @@
           </w:tcPr>
           <w:p>
             <w:r>
-              <w:t>doc. MUDr. [[PERSON_54]], Ph.D.</w:t>
+              <w:t>doc. MUDr. [[PERSON_56]], Ph.D.</w:t>
             </w:r>
           </w:p>
         </w:tc>
@@ -1064,7 +1064,7 @@
         <w:spacing w:before="30" w:after="100"/>
       </w:pPr>
       <w:r>
-        <w:t>✓ Vzácná jména: [[PERSON_51]], [[PERSON_28]], [[PERSON_29]], [[PERSON_45]], [[PERSON_27]]</w:t>
+        <w:t>✓ Vzácná jména: [[PERSON_46]], [[PERSON_45]], [[PERSON_27]]</w:t>
       </w:r>
     </w:p>
     <w:p>

</xml_diff>